<commit_message>
Insert rbaa-sim v1.1.0 DOI 10.5281/zenodo.23758119; allow DOIs one at a time
Co-Authored-By: Claude Opus 5.5 <noreply@anthropic.com>
Claude-Session: https://claude.ai/code/session_01NHsBp9wRWCVAWBqFXkwvVq
</commit_message>
<xml_diff>
--- a/elsevier_submission/Manuscript_RBAA_DigitalBusiness.docx
+++ b/elsevier_submission/Manuscript_RBAA_DigitalBusiness.docx
@@ -713,7 +713,7 @@
         <w:jc w:val="left"/>
       </w:pPr>
       <w:r>
-        <w:t xml:space="preserve">rbaa-sim, version 1.1.0 (Prokopovych-Tkachenko, 2026a; https://doi.org/10.5281/zenodo.SIM_DOI), is a self-contained Jupyter and Google Colab notebook without empirical data. It implements Equations (1)–(3) and the routing rule of Table 2, reproduces Table A1 and Table 7, checks the derivatives of Appendix A numerically, computes the optima e* and the marginal-only stopping rates within valid probability bounds (Figure A1) and estimates simulation-based power (Figure A2). It also runs the analysis plan of Appendix C.9 on synthetic trial data, with a design-weighted outcome audit, randomised threshold-policy contrasts for H4 and a firm-level moderation model for H5.</w:t>
+        <w:t xml:space="preserve">rbaa-sim, version 1.1.0 (Prokopovych-Tkachenko, 2026a; https://doi.org/10.5281/zenodo.23758119), is a self-contained Jupyter and Google Colab notebook without empirical data. It implements Equations (1)–(3) and the routing rule of Table 2, reproduces Table A1 and Table 7, checks the derivatives of Appendix A numerically, computes the optima e* and the marginal-only stopping rates within valid probability bounds (Figure A1) and estimates simulation-based power (Figure A2). It also runs the analysis plan of Appendix C.9 on synthetic trial data, with a design-weighted outcome audit, randomised threshold-policy contrasts for H4 and a firm-level moderation model for H5.</w:t>
       </w:r>
     </w:p>
     <w:p>
@@ -12682,7 +12682,7 @@
         <w:jc w:val="left"/>
       </w:pPr>
       <w:r>
-        <w:t xml:space="preserve">Data availability: No primary participant data were collected. The analytical derivation and hypothetical inputs are provided in the manuscript. The code and archived outputs that reproduce all calculations are openly available on Zenodo under the MIT licence: rbaa-sim, version 1.1.0 (https://doi.org/10.5281/zenodo.SIM_DOI), for Tables A1 and 7, Appendix A, Figures A1–A2 and the synthetic analysis pipeline of Appendix C; rbaa-validation, version 1.1.0 (https://doi.org/10.5281/zenodo.VAL_DOI), for Appendix B and Figures B1–B3; and rbaa-benchmark, version 1.0.0 (https://doi.org/10.5281/zenodo.BEN_DOI), for Section 5, Tables 3–4 and Figures 2–3, also supplied as Supplementary Material S1. Versions 1.0.0 of rbaa-sim and rbaa-validation remain available at https://doi.org/10.5281/zenodo.23421069 and https://doi.org/10.5281/zenodo.23421157. The Zenodo records identify Dmytro Prokopovych-Tkachenko as the deposited creator, with the co-authors listed as contributors. The transaction data are the public ULB/Worldline release (284,807 rows, 492 frauds), which retains its own Open Database/Database Contents terms and is not relicensed by the software licence; the packages download it from a public mirror and verify the SHA-256 checksum 76274b691b16a6c49d3f159c883398e03ccd6d1ee12d9d8ee38f4b4b98551a89. Section 5 was computed with Python 3.13 and scikit-learn 1.9.1. Eurostat data are used under the Eurostat re-use policy. No field data or trial registration exists.</w:t>
+        <w:t xml:space="preserve">Data availability: No primary participant data were collected. The analytical derivation and hypothetical inputs are provided in the manuscript. The code and archived outputs that reproduce all calculations are openly available on Zenodo under the MIT licence: rbaa-sim, version 1.1.0 (https://doi.org/10.5281/zenodo.23758119), for Tables A1 and 7, Appendix A, Figures A1–A2 and the synthetic analysis pipeline of Appendix C; rbaa-validation, version 1.1.0 (https://doi.org/10.5281/zenodo.VAL_DOI), for Appendix B and Figures B1–B3; and rbaa-benchmark, version 1.0.0 (https://doi.org/10.5281/zenodo.BEN_DOI), for Section 5, Tables 3–4 and Figures 2–3, also supplied as Supplementary Material S1. Versions 1.0.0 of rbaa-sim and rbaa-validation remain available at https://doi.org/10.5281/zenodo.23421069 and https://doi.org/10.5281/zenodo.23421157. The Zenodo records identify Dmytro Prokopovych-Tkachenko as the deposited creator, with the co-authors listed as contributors. The transaction data are the public ULB/Worldline release (284,807 rows, 492 frauds), which retains its own Open Database/Database Contents terms and is not relicensed by the software licence; the packages download it from a public mirror and verify the SHA-256 checksum 76274b691b16a6c49d3f159c883398e03ccd6d1ee12d9d8ee38f4b4b98551a89. Section 5 was computed with Python 3.13 and scikit-learn 1.9.1. Eurostat data are used under the Eurostat re-use policy. No field data or trial registration exists.</w:t>
       </w:r>
     </w:p>
     <w:p>
@@ -26050,7 +26050,7 @@
         <w:jc w:val="left"/>
       </w:pPr>
       <w:r>
-        <w:t xml:space="preserve">Prokopovych-Tkachenko, D. (2026a). rbaa-sim: Reproducible Colab notebook for the risk-based attention allocation model of AI oversight in SMEs (Version 1.1.0) [Computer software]. Zenodo. https://doi.org/10.5281/zenodo.SIM_DOI</w:t>
+        <w:t xml:space="preserve">Prokopovych-Tkachenko, D. (2026a). rbaa-sim: Reproducible Colab notebook for the risk-based attention allocation model of AI oversight in SMEs (Version 1.1.0) [Computer software]. Zenodo. https://doi.org/10.5281/zenodo.23758119</w:t>
       </w:r>
     </w:p>
     <w:p>

</xml_diff>

<commit_message>
Insert rbaa-validation v1.1.0 DOI 10.5281/zenodo.23758246 and expand its description in Section 3.3
Co-Authored-By: Claude Opus 5.5 <noreply@anthropic.com>
Claude-Session: https://claude.ai/code/session_01NHsBp9wRWCVAWBqFXkwvVq
</commit_message>
<xml_diff>
--- a/elsevier_submission/Manuscript_RBAA_DigitalBusiness.docx
+++ b/elsevier_submission/Manuscript_RBAA_DigitalBusiness.docx
@@ -726,7 +726,20 @@
         <w:jc w:val="left"/>
       </w:pPr>
       <w:r>
-        <w:t xml:space="preserve">rbaa-validation, version 1.1.0 (Prokopovych-Tkachenko, 2026b; https://doi.org/10.5281/zenodo.VAL_DOI), contains the archived counterfactual back-test on public card transactions and the Eurostat adoption context reported in Appendix B (Figures B1–B3). rbaa-benchmark, version 1.0.0 (Prokopovych-Tkachenko, 2026c; https://doi.org/10.5281/zenodo.BEN_DOI), is supplied as Supplementary Material S1 and reproduces the comparative validation of Section 5, including Tables 3 and 4, Figures 2 and 3 and the robustness analyses. The transaction data are not redistributed: both data-based packages download the original public release and verify it by checksum before any calculation.</w:t>
+        <w:t xml:space="preserve">rbaa-validation, version 1.1.0 (Prokopovych-Tkachenko, 2026b; https://doi.org/10.5281/zenodo.23758246), is a Google Colab notebook that reproduces Appendix B. It redraws the Eurostat (2026b) adoption figures by enterprise size class (Figure B1) and contains the archived counterfactual back-test on the public ULB/Worldline card transactions: a calibrated gradient-boosting classifier trained on the first 60% of elapsed time, the comparison of RBAA with amount-based approval limits, random spot checks and an AI-score alert queue under the same review budget, the load-aware and isolated stopping rules, the €1,000 hard floor and an hour-block bootstrap (Figures B2–B3). Version 1.1.0 reproduces all values printed in Appendix B unchanged from version 1.0.0 (https://doi.org/10.5281/zenodo.23421157).</w:t>
+      </w:r>
+    </w:p>
+    <w:p>
+      <w:pPr>
+        <w:pStyle w:val="Normal"/>
+        <w:keepNext w:val="0"/>
+        <w:keepLines w:val="0"/>
+        <w:pageBreakBefore w:val="0"/>
+        <w:widowControl/>
+        <w:jc w:val="left"/>
+      </w:pPr>
+      <w:r>
+        <w:t xml:space="preserve">rbaa-benchmark, version 1.0.0 (Prokopovych-Tkachenko, 2026c; https://doi.org/10.5281/zenodo.BEN_DOI), is supplied as Supplementary Material S1 and reproduces the comparative validation of Section 5, including Tables 3 and 4, Figures 2 and 3 and the robustness analyses. The transaction data are not redistributed: both data-based packages download the original public release and verify it by checksum before any calculation.</w:t>
       </w:r>
     </w:p>
     <w:p>
@@ -12682,7 +12695,7 @@
         <w:jc w:val="left"/>
       </w:pPr>
       <w:r>
-        <w:t xml:space="preserve">Data availability: No primary participant data were collected. The analytical derivation and hypothetical inputs are provided in the manuscript. The code and archived outputs that reproduce all calculations are openly available on Zenodo under the MIT licence: rbaa-sim, version 1.1.0 (https://doi.org/10.5281/zenodo.23758119), for Tables A1 and 7, Appendix A, Figures A1–A2 and the synthetic analysis pipeline of Appendix C; rbaa-validation, version 1.1.0 (https://doi.org/10.5281/zenodo.VAL_DOI), for Appendix B and Figures B1–B3; and rbaa-benchmark, version 1.0.0 (https://doi.org/10.5281/zenodo.BEN_DOI), for Section 5, Tables 3–4 and Figures 2–3, also supplied as Supplementary Material S1. Versions 1.0.0 of rbaa-sim and rbaa-validation remain available at https://doi.org/10.5281/zenodo.23421069 and https://doi.org/10.5281/zenodo.23421157. The Zenodo records identify Dmytro Prokopovych-Tkachenko as the deposited creator, with the co-authors listed as contributors. The transaction data are the public ULB/Worldline release (284,807 rows, 492 frauds), which retains its own Open Database/Database Contents terms and is not relicensed by the software licence; the packages download it from a public mirror and verify the SHA-256 checksum 76274b691b16a6c49d3f159c883398e03ccd6d1ee12d9d8ee38f4b4b98551a89. Section 5 was computed with Python 3.13 and scikit-learn 1.9.1. Eurostat data are used under the Eurostat re-use policy. No field data or trial registration exists.</w:t>
+        <w:t xml:space="preserve">Data availability: No primary participant data were collected. The analytical derivation and hypothetical inputs are provided in the manuscript. The code and archived outputs that reproduce all calculations are openly available on Zenodo under the MIT licence: rbaa-sim, version 1.1.0 (https://doi.org/10.5281/zenodo.23758119), for Tables A1 and 7, Appendix A, Figures A1–A2 and the synthetic analysis pipeline of Appendix C; rbaa-validation, version 1.1.0 (https://doi.org/10.5281/zenodo.23758246), for Appendix B and Figures B1–B3; and rbaa-benchmark, version 1.0.0 (https://doi.org/10.5281/zenodo.BEN_DOI), for Section 5, Tables 3–4 and Figures 2–3, also supplied as Supplementary Material S1. Versions 1.0.0 of rbaa-sim and rbaa-validation remain available at https://doi.org/10.5281/zenodo.23421069 and https://doi.org/10.5281/zenodo.23421157. The Zenodo records identify Dmytro Prokopovych-Tkachenko as the deposited creator, with the co-authors listed as contributors. The transaction data are the public ULB/Worldline release (284,807 rows, 492 frauds), which retains its own Open Database/Database Contents terms and is not relicensed by the software licence; the packages download it from a public mirror and verify the SHA-256 checksum 76274b691b16a6c49d3f159c883398e03ccd6d1ee12d9d8ee38f4b4b98551a89. Section 5 was computed with Python 3.13 and scikit-learn 1.9.1. Eurostat data are used under the Eurostat re-use policy. No field data or trial registration exists.</w:t>
       </w:r>
     </w:p>
     <w:p>
@@ -26063,7 +26076,7 @@
         <w:jc w:val="left"/>
       </w:pPr>
       <w:r>
-        <w:t xml:space="preserve">Prokopovych-Tkachenko, D. (2026b). rbaa-validation: Back-test of risk-based attention allocation on real open data—Eurostat AI adoption and 284,807 real transactions (Version 1.1.0) [Computer software]. Zenodo. https://doi.org/10.5281/zenodo.VAL_DOI</w:t>
+        <w:t xml:space="preserve">Prokopovych-Tkachenko, D. (2026b). rbaa-validation: Back-test of risk-based attention allocation on real open data—Eurostat AI adoption and 284,807 real transactions (Version 1.1.0) [Computer software]. Zenodo. https://doi.org/10.5281/zenodo.23758246</w:t>
       </w:r>
     </w:p>
     <w:p>

</xml_diff>

<commit_message>
Insert rbaa-benchmark v1.0.0 DOI 10.5281/zenodo.23758396 and expand its description in Section 3.3
Co-Authored-By: Claude Opus 5.5 <noreply@anthropic.com>
Claude-Session: https://claude.ai/code/session_01NHsBp9wRWCVAWBqFXkwvVq
</commit_message>
<xml_diff>
--- a/elsevier_submission/Manuscript_RBAA_DigitalBusiness.docx
+++ b/elsevier_submission/Manuscript_RBAA_DigitalBusiness.docx
@@ -739,7 +739,7 @@
         <w:jc w:val="left"/>
       </w:pPr>
       <w:r>
-        <w:t xml:space="preserve">rbaa-benchmark, version 1.0.0 (Prokopovych-Tkachenko, 2026c; https://doi.org/10.5281/zenodo.BEN_DOI), is supplied as Supplementary Material S1 and reproduces the comparative validation of Section 5, including Tables 3 and 4, Figures 2 and 3 and the robustness analyses. The transaction data are not redistributed: both data-based packages download the original public release and verify it by checksum before any calculation.</w:t>
+        <w:t xml:space="preserve">rbaa-benchmark, version 1.0.0 (Prokopovych-Tkachenko, 2026c; https://doi.org/10.5281/zenodo.23758396), is supplied as Supplementary Material S1 and reproduces the comparative validation of Section 5. Its Python scripts score the out-of-time test period with calibrated classifiers, compare RBAA with the seven allocation rules under the tight, generous and matched-volume regimes with a paired 10-minute block bootstrap, and compute the 324-scenario sensitivity grid, the calibration and classifier robustness checks, the shadow price of attention, the total-cost-of-control indicators and the price of the hard floor (Tables 3 and 4, Figures 2 and 3). A built-in check compares all 74 numbers quoted in Section 5 and Appendix B with the values computed by the code. The transaction data are not redistributed: both data-based packages download the original public release and verify it by checksum before any calculation.</w:t>
       </w:r>
     </w:p>
     <w:p>
@@ -12695,7 +12695,7 @@
         <w:jc w:val="left"/>
       </w:pPr>
       <w:r>
-        <w:t xml:space="preserve">Data availability: No primary participant data were collected. The analytical derivation and hypothetical inputs are provided in the manuscript. The code and archived outputs that reproduce all calculations are openly available on Zenodo under the MIT licence: rbaa-sim, version 1.1.0 (https://doi.org/10.5281/zenodo.23758119), for Tables A1 and 7, Appendix A, Figures A1–A2 and the synthetic analysis pipeline of Appendix C; rbaa-validation, version 1.1.0 (https://doi.org/10.5281/zenodo.23758246), for Appendix B and Figures B1–B3; and rbaa-benchmark, version 1.0.0 (https://doi.org/10.5281/zenodo.BEN_DOI), for Section 5, Tables 3–4 and Figures 2–3, also supplied as Supplementary Material S1. Versions 1.0.0 of rbaa-sim and rbaa-validation remain available at https://doi.org/10.5281/zenodo.23421069 and https://doi.org/10.5281/zenodo.23421157. The Zenodo records identify Dmytro Prokopovych-Tkachenko as the deposited creator, with the co-authors listed as contributors. The transaction data are the public ULB/Worldline release (284,807 rows, 492 frauds), which retains its own Open Database/Database Contents terms and is not relicensed by the software licence; the packages download it from a public mirror and verify the SHA-256 checksum 76274b691b16a6c49d3f159c883398e03ccd6d1ee12d9d8ee38f4b4b98551a89. Section 5 was computed with Python 3.13 and scikit-learn 1.9.1. Eurostat data are used under the Eurostat re-use policy. No field data or trial registration exists.</w:t>
+        <w:t xml:space="preserve">Data availability: No primary participant data were collected. The analytical derivation and hypothetical inputs are provided in the manuscript. The code and archived outputs that reproduce all calculations are openly available on Zenodo under the MIT licence: rbaa-sim, version 1.1.0 (https://doi.org/10.5281/zenodo.23758119), for Tables A1 and 7, Appendix A, Figures A1–A2 and the synthetic analysis pipeline of Appendix C; rbaa-validation, version 1.1.0 (https://doi.org/10.5281/zenodo.23758246), for Appendix B and Figures B1–B3; and rbaa-benchmark, version 1.0.0 (https://doi.org/10.5281/zenodo.23758396), for Section 5, Tables 3–4 and Figures 2–3, also supplied as Supplementary Material S1. Versions 1.0.0 of rbaa-sim and rbaa-validation remain available at https://doi.org/10.5281/zenodo.23421069 and https://doi.org/10.5281/zenodo.23421157. The Zenodo records identify Dmytro Prokopovych-Tkachenko as the deposited creator, with the co-authors listed as contributors. The transaction data are the public ULB/Worldline release (284,807 rows, 492 frauds), which retains its own Open Database/Database Contents terms and is not relicensed by the software licence; the packages download it from a public mirror and verify the SHA-256 checksum 76274b691b16a6c49d3f159c883398e03ccd6d1ee12d9d8ee38f4b4b98551a89. Section 5 was computed with Python 3.13 and scikit-learn 1.9.1. Eurostat data are used under the Eurostat re-use policy. No field data or trial registration exists.</w:t>
       </w:r>
     </w:p>
     <w:p>
@@ -26089,7 +26089,7 @@
         <w:jc w:val="left"/>
       </w:pPr>
       <w:r>
-        <w:t xml:space="preserve">Prokopovych-Tkachenko, D. (2026c). rbaa-benchmark: Comparative validation of risk-based attention allocation against seven review-allocation rules on 129,878 real card transactions (Version 1.0.0) [Computer software]. Zenodo. https://doi.org/10.5281/zenodo.BEN_DOI</w:t>
+        <w:t xml:space="preserve">Prokopovych-Tkachenko, D. (2026c). rbaa-benchmark: Comparative validation of risk-based attention allocation against seven review-allocation rules on 129,878 real card transactions (Version 1.0.0) [Computer software]. Zenodo. https://doi.org/10.5281/zenodo.23758396</w:t>
       </w:r>
     </w:p>
     <w:p>

</xml_diff>